<commit_message>
Update Motion documentation handover
</commit_message>
<xml_diff>
--- a/motion/GT-Motion-Codex-Handover-July-2026.docx
+++ b/motion/GT-Motion-Codex-Handover-July-2026.docx
@@ -18,6 +18,92 @@
       </w:pPr>
       <w:r>
         <w:t>Context, decisions, implementation status and working guidance for continuing the framework</w:t>
+      </w:r>
+    </w:p>
+    <w:p>
+      <w:pPr>
+        <w:pStyle w:val="Heading1"/>
+      </w:pPr>
+      <w:r>
+        <w:t>Current handover — 17 July 2026</w:t>
+      </w:r>
+    </w:p>
+    <w:p>
+      <w:pPr/>
+      <w:r>
+        <w:t>This section is the authoritative handover point for the next chat. It supersedes the 16 July implementation update and the older roadmap below wherever they differ. Source and executable examples remain the truth for implemented behaviour.</w:t>
+      </w:r>
+    </w:p>
+    <w:p>
+      <w:pPr>
+        <w:pStyle w:val="Heading2"/>
+      </w:pPr>
+      <w:r>
+        <w:t>Confirmed public model</w:t>
+      </w:r>
+    </w:p>
+    <w:p>
+      <w:pPr/>
+      <w:r>
+        <w:t>CFMotion is the one live running Motion. CFMotionBuilder is the common configuration and construction surface: it holds the element, duration, easing and other settings shared by every Motion, then builds a CFMotion.</w:t>
+      </w:r>
+    </w:p>
+    <w:p>
+      <w:pPr/>
+      <w:r>
+        <w:t>A simple named request builds and starts synchronously: element motion fadeOut. A customised named request uses an ordinary Smalltalk block as an explicit configuration boundary: element motion fadeIn: [ :builder | builder duration: 500 milliSeconds ]. Motion builds and starts immediately when that block returns. The block is not a framework object or an event handler.</w:t>
+      </w:r>
+    </w:p>
+    <w:p>
+      <w:pPr/>
+      <w:r>
+        <w:t>Named motions that have extra vocabulary use the appropriate configuration builder. Common settings such as duration: and easing: are shared; behaviour-specific settings such as distance:, bounciness: and colourShift: belong only to the builder for the named motion that understands them. Do not put every possible option on the generic builder.</w:t>
+      </w:r>
+    </w:p>
+    <w:p>
+      <w:pPr/>
+      <w:r>
+        <w:t>A complex custom Motion remains explicit and synchronous: configure an element-bound builder, send build to receive a CFMotion, then send start. Do not use a next-frame or end-of-cascade auto-start mechanism; Smalltalk has no reliable end-of-cascade boundary.</w:t>
+      </w:r>
+    </w:p>
+    <w:p>
+      <w:pPr>
+        <w:pStyle w:val="Heading2"/>
+      </w:pPr>
+      <w:r>
+        <w:t>Current implementation status</w:t>
+      </w:r>
+    </w:p>
+    <w:p>
+      <w:pPr/>
+      <w:r>
+        <w:t>This API direction is agreed design, not yet implemented source. The current source still exposes CFMotionBuilder from element motion and requires explicit construction/start for ordinary custom Motion. Do not claim the no-argument or block-form named API is loaded until focused executable examples prove it.</w:t>
+      </w:r>
+    </w:p>
+    <w:p>
+      <w:pPr/>
+      <w:r>
+        <w:t>The existing live gallery is intentionally not the model to preserve. It uses gallery-owned click handlers and current-Motion state to replay demonstrations. Rebuild it only after the public API exists: each Lepiter snippet must obtain its visual fixture from CFMotionGalleryExamples, issue one public Motion request, and return the visual. Users must never write handlers or retain current Motion state merely to use Motion.</w:t>
+      </w:r>
+    </w:p>
+    <w:p>
+      <w:pPr>
+        <w:pStyle w:val="Heading2"/>
+      </w:pPr>
+      <w:r>
+        <w:t>Naming and next-session discipline</w:t>
+      </w:r>
+    </w:p>
+    <w:p>
+      <w:pPr/>
+      <w:r>
+        <w:t>Do not invent names. Before adding a specialised configuration builder or any new public selector, state its role and proposed name and obtain approval. Avoid the words recipe and catalogue. Do not extend CFMotionEffectRecipe or treat effects as the public abstraction.</w:t>
+      </w:r>
+    </w:p>
+    <w:p>
+      <w:pPr/>
+      <w:r>
+        <w:t>Next session: first agree the concrete builder names needed for the approved model; then implement focused examples for direct named motion, block configuration, complex explicit build/start, attachment and cancellation; run the full Foundation example suite in GT; commit Foundation first, then the workspace submodule pointer. Only then rebuild the Lepiter gallery and refresh its snippets.</w:t>
       </w:r>
     </w:p>
     <w:tbl>
@@ -70,7 +156,7 @@
         <w:pStyle w:val="Heading1"/>
       </w:pPr>
       <w:r>
-        <w:t>Implementation Update — 16 July 2026</w:t>
+        <w:t>Historical implementation update — 16 July 2026</w:t>
       </w:r>
     </w:p>
     <w:p>

</xml_diff>